<commit_message>
Add inline supplementary-material cross-references to manuscript body
Journal-style: instead of only a summary statement at the end, each
Results subsection (and Methods 2.3) now points inline to the specific
supplementary table/figure that carries its full statistics or
underlying per-cohort plots (e.g. "Supplementary Table S1a", "see also
Supplementary Figures S1-S8"), and Figure 1/2 captions cross-reference
the individual cohort-level supplementary figures they summarize.

Also fixes 3 stale references from an earlier supplement numbering
scheme (S6->S1d, S1->S2e, S2->S3) that no longer matched the final
five-section (S1-S5) structure of supplementary_materials.docx.
Verified: all 23 in-text citations still resolve 1:1 to the reference
list with no gaps.
</commit_message>
<xml_diff>
--- a/manuscript/manuscript.docx
+++ b/manuscript/manuscript.docx
@@ -190,7 +190,7 @@
     </w:p>
     <w:p>
       <w:r>
-        <w:t>For RNA-seq count data (GSE135251), gene-level Ensembl counts were obtained per sample, genes with mean count &lt; 10 across samples were removed except for pre-specified panel genes (which were retained regardless of this filter to accommodate the comparatively low bulk-tissue expression of neutrophil-lineage transcripts, with per-gene detection rates reported explicitly in Supplementary Table S6), and variance-stabilizing transformation (blind to any grouping variable) was applied using DESeq2 (20). For microarray data (GSE14323, GSE47460, GSE53845), previously normalized expression values provided by data submitters were used as-is (confirmed log2-scale; RMA for GSE14323, cyclic-loess for GSE47460, two-color log-ratio for GSE53845). Where a gene symbol mapped to multiple Ensembl IDs or probes, the ID/probe with the highest mean expression across the cohort was retained. For the HCC-ICI cohorts (GSE215011, GSE279750: per-sample tables; GSE235863: a shared TPM matrix), gene-level expression was log2(x+1)-transformed.</w:t>
+        <w:t>For RNA-seq count data (GSE135251), gene-level Ensembl counts were obtained per sample, genes with mean count &lt; 10 across samples were removed except for pre-specified panel genes (which were retained regardless of this filter to accommodate the comparatively low bulk-tissue expression of neutrophil-lineage transcripts, with per-gene detection rates reported explicitly in Supplementary Table S1d), and variance-stabilizing transformation (blind to any grouping variable) was applied using DESeq2 (20). For microarray data (GSE14323, GSE47460, GSE53845), previously normalized expression values provided by data submitters were used as-is (confirmed log2-scale; RMA for GSE14323, cyclic-loess for GSE47460, two-color log-ratio for GSE53845). Where a gene symbol mapped to multiple Ensembl IDs or probes, the ID/probe with the highest mean expression across the cohort was retained. For the HCC-ICI cohorts (GSE215011, GSE279750: per-sample tables; GSE235863: a shared TPM matrix), gene-level expression was log2(x+1)-transformed.</w:t>
       </w:r>
     </w:p>
     <w:p>
@@ -781,12 +781,12 @@
     </w:p>
     <w:p>
       <w:r>
-        <w:t>Across all four independent fibrosis cohorts, the pre-specified primary endpoint — Spearman correlation between HSF2 and the NETosis-core score (PADI4/ELANE/MPO) within diseased/fibrotic tissue — was negative in direction, opposite to the original hypothesis (Table 2, Figure 1). The correlation reached nominal significance in three of four cohorts: GSE135251 (liver, n = 206 NAFLD samples), rho = −0.14 (95% CI −0.29 to 0.00), p = 0.038; GSE14323 (liver, n = 96 diseased samples), rho = −0.55 (95% CI −0.69 to −0.38), p = 6.2 × 10⁻⁹; and GSE47460 (lung, n = 122 UIP/IPF samples), rho = −0.39 (95% CI −0.54 to −0.22), p = 8.1 × 10⁻⁶. GSE53845 (lung, n = 40 IPF samples) showed a negative point estimate of smaller magnitude that did not reach significance (rho = −0.05, p = 0.76); given its markedly smaller sample size, this cohort was interpreted as underpowered rather than as evidence against the direction observed elsewhere. By the pre-specified replication rule, the liver primary/replication pair (GSE135251, GSE14323) met the criterion for replication (same sign, both p &lt; 0.05); the lung pair did not formally meet the criterion because GSE53845 was not individually significant, though the direction was concordant.</w:t>
+        <w:t>Across all four independent fibrosis cohorts, the pre-specified primary endpoint — Spearman correlation between HSF2 and the NETosis-core score (PADI4/ELANE/MPO) within diseased/fibrotic tissue — was negative in direction, opposite to the original hypothesis (Table 2, Figure 1). The correlation reached nominal significance in three of four cohorts: GSE135251 (liver, n = 206 NAFLD samples), rho = −0.14 (95% CI −0.29 to 0.00), p = 0.038; GSE14323 (liver, n = 96 diseased samples), rho = −0.55 (95% CI −0.69 to −0.38), p = 6.2 × 10⁻⁹; and GSE47460 (lung, n = 122 UIP/IPF samples), rho = −0.39 (95% CI −0.54 to −0.22), p = 8.1 × 10⁻⁶. GSE53845 (lung, n = 40 IPF samples) showed a negative point estimate of smaller magnitude that did not reach significance (rho = −0.05, p = 0.76); given its markedly smaller sample size, this cohort was interpreted as underpowered rather than as evidence against the direction observed elsewhere. By the pre-specified replication rule, the liver primary/replication pair (GSE135251, GSE14323) met the criterion for replication (same sign, both p &lt; 0.05); the lung pair did not formally meet the criterion because GSE53845 was not individually significant, though the direction was concordant. Full statistics for this endpoint, including bootstrap confidence intervals and leave-one-out sensitivity ranges for each cohort, are provided in Supplementary Table S1a; per-cohort scatter plots and boxplots underlying Table 2 and Figure 1 are provided in Supplementary Figures S1–S8.</w:t>
       </w:r>
     </w:p>
     <w:p>
       <w:r>
-        <w:t>A random-effects meta-analysis of all four cohorts yielded a pooled rho of −0.31 (95% CI −0.51 to −0.08, p = 0.010), with substantial heterogeneity (I² = 83.5%) attributable largely to the smaller-magnitude GSE53845 estimate. Organ-restricted meta-analyses were directionally consistent but individually non-significant given only two studies each (liver-only pooled rho = −0.36, 95% CI −0.69 to 0.09, p = 0.11; lung-only pooled rho = −0.25, 95% CI −0.54 to 0.10, p = 0.15).</w:t>
+        <w:t>A random-effects meta-analysis of all four cohorts yielded a pooled rho of −0.31 (95% CI −0.51 to −0.08, p = 0.010), with substantial heterogeneity (I² = 83.5%) attributable largely to the smaller-magnitude GSE53845 estimate. Organ-restricted meta-analyses were directionally consistent but individually non-significant given only two studies each (liver-only pooled rho = −0.36, 95% CI −0.69 to 0.09, p = 0.11; lung-only pooled rho = −0.25, 95% CI −0.54 to 0.10, p = 0.15) (full meta-analysis output: Supplementary Table S1b).</w:t>
       </w:r>
     </w:p>
     <w:p>
@@ -1314,7 +1314,7 @@
           <w:i/>
           <w:sz w:val="20"/>
         </w:rPr>
-        <w:t>Forest plot of the pre-specified primary endpoint (Spearman rho, HSF2 vs. NETosis-core score) across all four fibrosis cohorts and pooled random-effects estimates. Error bars are bootstrap (cohort-level) or random-effects meta-analytic (pooled) 95% confidence intervals; point size is proportional to sample size.</w:t>
+        <w:t>Forest plot of the pre-specified primary endpoint (Spearman rho, HSF2 vs. NETosis-core score) across all four fibrosis cohorts and pooled random-effects estimates. Error bars are bootstrap (cohort-level) or random-effects meta-analytic (pooled) 95% confidence intervals; point size is proportional to sample size. See also Supplementary Figures S1–S8 for the underlying per-cohort scatter plots and boxplots, and Supplementary Table S1a for full statistics.</w:t>
       </w:r>
     </w:p>
     <w:p>
@@ -1327,7 +1327,7 @@
     </w:p>
     <w:p>
       <w:r>
-        <w:t>Because bulk-tissue expression reflects the mixture of resident and infiltrating cell types, an increase in overall immune infiltration accompanying advancing fibrosis could, in principle, dilute the relative contribution of non-immune, HSF2-expressing cells to the bulk signal — a trivial explanation unrelated to any specific regulatory relationship. This was tested directly using PTPRC (CD45) as a pan-leukocyte marker in the two liver cohorts. In both cohorts, HSF2 correlated positively, not negatively, with PTPRC (GSE135251: rho = 0.18, p = 0.010; GSE14323: rho = 0.45, p = 4.7 × 10⁻⁶) (Table 3), the opposite direction from its correlation with the NETosis-core score. This pattern — HSF2 rising with overall immune infiltration while falling specifically with NETosis-core gene expression — is inconsistent with a simple dilution artifact and instead suggests a signal specific to the NETosis gene program.</w:t>
+        <w:t>Because bulk-tissue expression reflects the mixture of resident and infiltrating cell types, an increase in overall immune infiltration accompanying advancing fibrosis could, in principle, dilute the relative contribution of non-immune, HSF2-expressing cells to the bulk signal — a trivial explanation unrelated to any specific regulatory relationship. This was tested directly using PTPRC (CD45) as a pan-leukocyte marker in the two liver cohorts. In both cohorts, HSF2 correlated positively, not negatively, with PTPRC (GSE135251: rho = 0.18, p = 0.010; GSE14323: rho = 0.45, p = 4.7 × 10⁻⁶) (Table 3), the opposite direction from its correlation with the NETosis-core score. This pattern — HSF2 rising with overall immune infiltration while falling specifically with NETosis-core gene expression — is inconsistent with a simple dilution artifact and instead suggests a signal specific to the NETosis gene program. Full statistics, including bootstrap confidence intervals and leave-one-out sensitivity ranges for all three pairwise correlations in both cohorts, are provided in Supplementary Table S1c.</w:t>
       </w:r>
     </w:p>
     <w:p>
@@ -1549,7 +1549,7 @@
     </w:p>
     <w:p>
       <w:r>
-        <w:t>Decomposing the NETosis-extended panel into individual genes and examining their direction of association with HSF2 across all four cohorts (Table 4; full results in Supplementary Table S1) revealed two distinct patterns. Five genes — CAMP, MPO, DEFA4, and, with one small-magnitude exception each, PADI4 and ELANE — showed the same (negative) direction of association with HSF2 in all four cohorts, reaching FDR &lt; 0.05 in two to three of four cohorts each. In contrast, four genes — LTF, NCF2, ITGAM, and LCN2 — showed sign reversal between liver and lung cohorts (e.g., LTF: negative in GSE135251 but positive and FDR-significant in both lung cohorts), a pattern that may reflect organ-specific regulation or a lesser degree of neutrophil-lineage specificity for these genes (LCN2 in particular is also broadly expressed by stressed hepatocytes and epithelial cells).</w:t>
+        <w:t>Decomposing the NETosis-extended panel into individual genes and examining their direction of association with HSF2 across all four cohorts (Table 4; full per-cohort individual-gene results: Supplementary Tables S2; full 12-gene cross-cohort consistency table: Supplementary Table S2e) revealed two distinct patterns. Five genes — CAMP, MPO, DEFA4, and, with one small-magnitude exception each, PADI4 and ELANE — showed the same (negative) direction of association with HSF2 in all four cohorts, reaching FDR &lt; 0.05 in two to three of four cohorts each. In contrast, four genes — LTF, NCF2, ITGAM, and LCN2 — showed sign reversal between liver and lung cohorts (e.g., LTF: negative in GSE135251 but positive and FDR-significant in both lung cohorts), a pattern that may reflect organ-specific regulation or a lesser degree of neutrophil-lineage specificity for these genes (LCN2 in particular is also broadly expressed by stressed hepatocytes and epithelial cells).</w:t>
       </w:r>
     </w:p>
     <w:p>
@@ -1557,7 +1557,7 @@
         <w:pStyle w:val="Heading3"/>
       </w:pPr>
       <w:r>
-        <w:t>Table 4. Cross-cohort consistency for the five most reproducible NETosis panel genes (full 12-gene table: Supplementary Table S1).</w:t>
+        <w:t>Table 4. Cross-cohort consistency for the five most reproducible NETosis panel genes (full 12-gene table: Supplementary Table S2e).</w:t>
       </w:r>
     </w:p>
     <w:tbl>
@@ -2206,7 +2206,7 @@
     </w:p>
     <w:p>
       <w:r>
-        <w:t>Querying ChEA3 with the consistently associated gene set (PADI4, ELANE, MPO, CAMP, DEFA4), the organ-divergent gene set, and the NETosis-core panel alone, HSF2 did not rank among the top candidate regulators in any of the eight ChEA3 evidence libraries for any query (Table 5). Where HSF2 was returned at all, its rank fell in approximately the bottom 10% of all ranked transcription factors (e.g., Integrated mean rank 1444 of 1632 for the consistent gene set), with zero gene overlap (intersect = 0) and an odds ratio of 0 in every co-expression-based library. HSF2 was not returned at all by the ENCODE ChIP-seq, ReMap ChIP-seq, or Literature ChIP-seq libraries for any of the three queries. This absence of supporting evidence is consistent with two non-exclusive possibilities: (i) ChEA3's co-expression-based libraries are structurally unable to detect a negative/repressive regulatory relationship of the kind observed here, and (ii) this specific regulatory axis has not previously been characterized in the public ChIP-seq and functional genomics literature.</w:t>
+        <w:t>Querying ChEA3 with the consistently associated gene set (PADI4, ELANE, MPO, CAMP, DEFA4), the organ-divergent gene set, and the NETosis-core panel alone, HSF2 did not rank among the top candidate regulators in any of the eight ChEA3 evidence libraries for any query (Table 5). Where HSF2 was returned at all, its rank fell in approximately the bottom 10% of all ranked transcription factors (e.g., Integrated mean rank 1444 of 1632 for the consistent gene set), with zero gene overlap (intersect = 0) and an odds ratio of 0 in every co-expression-based library. HSF2 was not returned at all by the ENCODE ChIP-seq, ReMap ChIP-seq, or Literature ChIP-seq libraries for any of the three queries. This absence of supporting evidence is consistent with two non-exclusive possibilities: (i) ChEA3's co-expression-based libraries are structurally unable to detect a negative/repressive regulatory relationship of the kind observed here, and (ii) this specific regulatory axis has not previously been characterized in the public ChIP-seq and functional genomics literature. Full results for all three queried gene sets across all eight ChEA3 libraries are provided in Supplementary Table S3.</w:t>
       </w:r>
     </w:p>
     <w:p>
@@ -2214,7 +2214,7 @@
         <w:pStyle w:val="Heading3"/>
       </w:pPr>
       <w:r>
-        <w:t>Table 5. ChEA3 in silico enrichment: HSF2 rank summary (consistent gene set query; full results for all 3 queries: Supplementary Table S2).</w:t>
+        <w:t>Table 5. ChEA3 in silico enrichment: HSF2 rank summary (consistent gene set query; full results for all 3 queries: Supplementary Table S3).</w:t>
       </w:r>
     </w:p>
     <w:tbl>
@@ -2776,7 +2776,7 @@
     </w:p>
     <w:p>
       <w:r>
-        <w:t>Because HSF2 has previously been reported to correlate positively with immune-checkpoint gene expression in HCC (11), we performed an exploratory analysis of whether tumor HSF2 expression associates with clinical response to ICI therapy, using three independent cohorts with different regimens (Table 6, Figure 2). In GSE215011 (nivolumab monotherapy, n = 5 responders/5 non-responders), HSF2 did not differ significantly between groups (rank-biserial r = 0.44, p = 0.30). In GSE279750 (anti-PD-L1-based combination, post-treatment, n = 6/4), HSF2 was significantly lower in responders (r = −0.92, p = 0.025). In GSE235863 (anti-PD-1 plus lenvatinib, post-treatment, n = 11/4), HSF2 was also significantly lower in responders (r = −0.73, p = 0.043). A random-effects meta-analysis of all three cohorts was not significant (pooled r = −0.59, 95% CI −0.94 to 0.39, p = 0.22), with high heterogeneity (I² = 87.1%) driven by the opposite-direction, non-significant estimate from the monotherapy cohort. Given the small sample sizes (total n = 35 across three cohorts), differing regimens, and differing sampling timepoints (baseline versus post-treatment), this analysis is reported as an unresolved, hypothesis-generating lead rather than a confirmed finding.</w:t>
+        <w:t>Because HSF2 has previously been reported to correlate positively with immune-checkpoint gene expression in HCC (11), we performed an exploratory analysis of whether tumor HSF2 expression associates with clinical response to ICI therapy, using three independent cohorts with different regimens (Table 6, Figure 2). In GSE215011 (nivolumab monotherapy, n = 5 responders/5 non-responders), HSF2 did not differ significantly between groups (rank-biserial r = 0.44, p = 0.30). In GSE279750 (anti-PD-L1-based combination, post-treatment, n = 6/4), HSF2 was significantly lower in responders (r = −0.92, p = 0.025). In GSE235863 (anti-PD-1 plus lenvatinib, post-treatment, n = 11/4), HSF2 was also significantly lower in responders (r = −0.73, p = 0.043). A random-effects meta-analysis of all three cohorts was not significant (pooled r = −0.59, 95% CI −0.94 to 0.39, p = 0.22), with high heterogeneity (I² = 87.1%) driven by the opposite-direction, non-significant estimate from the monotherapy cohort. Given the small sample sizes (total n = 35 across three cohorts), differing regimens, and differing sampling timepoints (baseline versus post-treatment), this analysis is reported as an unresolved, hypothesis-generating lead rather than a confirmed finding. Full per-cohort sample-level data, group comparisons, and HSF2-vs-NET_core correlations are provided in Supplementary Tables S4; the underlying per-cohort scatter plots and boxplots are provided in Supplementary Figures S9–S15.</w:t>
       </w:r>
     </w:p>
     <w:p>
@@ -3232,7 +3232,7 @@
           <w:i/>
           <w:sz w:val="20"/>
         </w:rPr>
-        <w:t>Forest plot of tumor HSF2 (responder vs. non-responder, rank-biserial correlation) across three independent HCC immune-checkpoint-inhibitor cohorts and the pooled random-effects estimate. Positive values indicate higher HSF2 in responders.</w:t>
+        <w:t>Forest plot of tumor HSF2 (responder vs. non-responder, rank-biserial correlation) across three independent HCC immune-checkpoint-inhibitor cohorts and the pooled random-effects estimate. Positive values indicate higher HSF2 in responders. See also Supplementary Figures S9–S15 for the underlying per-cohort scatter plots and boxplots, and Supplementary Tables S4 for full statistics.</w:t>
       </w:r>
     </w:p>
     <w:p>

</xml_diff>